<commit_message>
EN- und ERC-Antraege vereinheitlicht: Beleg-Audit statt Aenderungshistorie
Die durch schrittweise Ergaenzungen gewachsenen Ketten-Passagen aller
sechs EN- und sechs ERC-Fassungen sind zu einem einheitlichen
Endstands-Text konsolidiert: ein 'systematic evidence audit along the
descriptor chain' begruendet die Materialstrategie positiv (jede
Programmserie startet mit nachgewiesener Edelmetall-Schaltbasis und
dokumentierter Deskriptorachse: Ferrite, PCMO, Kobaltite, Pt/STO), statt
Ausschluesse und Screening-Chronologie zu erzaehlen; YBCO/GDC bleiben als
vorgeprüfte Blind-Validierungskandidaten benannt. LSMO-Begruendungssatz
gestrafft ('not part of the programme core' entfernt). Alle zwoelf
Dokumente XSD-validiert, Markdown regeneriert.

Co-Authored-By: Claude Fable 5 <noreply@anthropic.com>
Claude-Session: https://claude.ai/code/session_01Bk7Pr8s2NdP1JMtzGzdQap
</commit_message>
<xml_diff>
--- a/Material_1_STF_SrTiFeO3/DFG_EmmyNoether_COMET-Ox_STF_EN.docx
+++ b/Material_1_STF_SrTiFeO3/DFG_EmmyNoether_COMET-Ox_STF_EN.docx
@@ -2989,7 +2989,7 @@
           <w:sz w:val="21"/>
           <w:szCs w:val="21"/>
         </w:rPr>
-        <w:t xml:space="preserve"> itself lacks any noble-metal-interface demonstration (tip-based multilevel recording [68], reactive-contact interface devices [69, 88], in-situ TEM of vacancy-driven transitions [19]) and is therefore not part of the programme core.</w:t>
+        <w:t xml:space="preserve">, by contrast, offers no noble-metal-interface demonstration (tip-based multilevel recording [68], reactive-contact devices [69, 88], in-situ TEM of vacancy-driven transitions [19]).</w:t>
       </w:r>
       <w:r>
         <w:rPr>
@@ -3418,7 +3418,15 @@
           <w:sz w:val="21"/>
           <w:szCs w:val="21"/>
         </w:rPr>
-        <w:t xml:space="preserve"> only a polycrystalline study with a small doping window exists [80]. None of these studies links the series to computed vacancy formation energies, covalency descriptors or spectroscopic observables. Viewed along the descriptor chain, the evidence is complementary rather than complete: for the ferrite series the covalency axis is canonical [46] and EV(x) quantitative [31, 86], but intermediate-composition devices are absent – though switching under inert Au/SrRuO3 stacks is proven at the Sr-rich end member [16, 17], which turns the series from a feasibility risk into an optimisation space; for the manganite family the covalency axis is the calibration standard of the field [46] and noble-contact switching is proven for Pr1-xCaxMnO3 at a single composition [89], while EV is anchored only generically [42–44] and for La1-xSrxMnO3 no switching at a noble-metal interface has been reported for any composition – the reason the programme uses Pr1-xCaxMnO3 as its manganite series; and stoichiometry-controlled switching at a Pt interface has so far been shown only for the cation stoichiometry of SrTiO3 [78]. A systematic family screening across the oxide classes (cobaltites, nickelates, cuprates, further ferrites and manganites, fluorites) sharpens this picture: beyond the systems above, only YBa2Cu3O7-δ (Au/YBCO/Au switching established and replicated [90]) and Gd-doped CeO2 (Pt/Pt crossbars with a composition series [14]) fulfil all three evidence criteria – both are therefore reserved as pre-screened blind-validation candidates of the map (WP5).</w:t>
+        <w:t xml:space="preserve"> only a polycrystalline study with a small doping window exists [80]. None of these studies links the series to computed vacancy formation energies, covalency descriptors or spectroscopic observables. </w:t>
+      </w:r>
+      <w:r>
+        <w:rPr>
+          <w:rFonts w:ascii="Arial" w:hAnsi="Arial" w:cs="Arial"/>
+          <w:sz w:val="21"/>
+          <w:szCs w:val="21"/>
+        </w:rPr>
+        <w:t xml:space="preserve">A systematic evidence audit along the descriptor chain – covalency vs. stoichiometry (XAS), EV vs. covalency, and switching at a noble-metal interface – underpins the materials strategy of this proposal: every programme series enters with a demonstrated noble-contact switching base and a documented descriptor axis. The ferrites combine the canonical covalency XAS [46] and quantitative EV(x) [31, 86] with inert-stack switching at the Sr-rich end member [16, 17]; the manganite series Pr1-xCaxMnO3 combines the published composition benchmark [75] with noble Pt-contact switching [89]; the cobaltites combine the most explicit covalency→EV link of all families [39] with Au-active end-member switching [71, 25]; and stoichiometry-controlled switching at a Pt interface is demonstrated for the cation stoichiometry of SrTiO3 [78]. The same audit, extended as a family screening across the oxide classes, identifies YBa2Cu3O7-δ (Au/YBCO/Au established and replicated [90]) and Gd-doped CeO2 (Pt/Pt crossbars with a composition series [14]) as the only further systems fulfilling all three criteria – reserved as pre-screened blind-validation candidates of the map (WP5).</w:t>
       </w:r>
     </w:p>
     <w:p>

</xml_diff>